<commit_message>
report: correct test-2 accuracy, feature counts, authorship, add video links
- Fix test-2 accuracy 73.5% -> 70.6% (body + Fig 7) to match results CSVs
- Fix feature description to 4 time-domain + 3 frequency-domain (all FFT)
- Soften training-device claim (3 training clips were on the Pixel 6)
- Credit Baum-Welch for the 75.7% -> 81.4% gain, not Viterbi alone
- Fill title block (solo submission), embed all four data-collection videos
- README: add Results summary + video links
</commit_message>
<xml_diff>
--- a/HMM_Activity_Recognition_Report.docx
+++ b/HMM_Activity_Recognition_Report.docx
@@ -45,7 +45,7 @@
           <w:sz w:val="19"/>
           <w:szCs w:val="19"/>
         </w:rPr>
-        <w:t xml:space="preserve">Group: [YOUR GROUP NAME]   •   Members: [NAME 1, NAME 2, NAME 3]</w:t>
+        <w:t xml:space="preserve">Enock Mugisha   •   Individual submission</w:t>
       </w:r>
     </w:p>
     <w:p>
@@ -88,22 +88,7 @@
           <w:sz w:val="21"/>
           <w:szCs w:val="21"/>
         </w:rPr>
-        <w:t xml:space="preserve">Continuous motion signals from the smartphones and wearables people already carry are a cheap, scalable window into human activity, but the activity itself is never measured directly: it is a hidden state buried under noisy accelerometer and gyroscope streams. Our group's use case is community-based physical-activity and mobility monitoring for elderly and post-rehabilitation patients in Rwanda, where clinicians cannot observe patients continuously and dedicated medical sensors are costly. A phone in the pocket that can reliably tell standing from walking, jumping from lying still lets a health worker track whether a recovering patient is meeting daily mobility targets, flag long sedentary periods, and detect sudden high-impact events — all from one everyday device. Because the true activity is latent and transitions between activities are sequential and correlated in time, a Hidden Markov Model (HMM), which explicitly models hidden states, their transitions, and noisy emissions, is a natural fit for turning raw sensor data into clinically meaningful activity labels.</w:t>
-      </w:r>
-    </w:p>
-    <w:p>
-      <w:pPr>
-        <w:spacing w:after="60"/>
-      </w:pPr>
-      <w:r>
-        <w:rPr>
-          <w:i/>
-          <w:iCs/>
-          <w:color w:val="A04000"/>
-          <w:sz w:val="18"/>
-          <w:szCs w:val="18"/>
-        </w:rPr>
-        <w:t xml:space="preserve">Edit this paragraph to state your group's own specific use case before submitting.</w:t>
+        <w:t xml:space="preserve">Continuous motion signals from the smartphones and wearables people already carry are a cheap, scalable window into human activity, but the activity itself is never measured directly: it is a hidden state buried under noisy accelerometer and gyroscope streams. My use case is community-based physical-activity and mobility monitoring for elderly and post-rehabilitation patients in Rwanda, where clinicians cannot observe patients continuously and dedicated medical sensors are costly. A phone in the pocket that can reliably tell standing from walking, jumping from lying still lets a health worker track whether a recovering patient is meeting daily mobility targets, flag long sedentary periods, and detect sudden high-impact events — all from one everyday device. Because the true activity is latent and transitions between activities are sequential and correlated in time, a Hidden Markov Model (HMM), which explicitly models hidden states, their transitions, and noisy emissions, is a natural fit for turning raw sensor data into clinically meaningful activity labels.</w:t>
       </w:r>
     </w:p>
     <w:p>
@@ -142,7 +127,7 @@
           <w:sz w:val="21"/>
           <w:szCs w:val="21"/>
         </w:rPr>
-        <w:t xml:space="preserve">All data was recorded with the Sensor Logger app in Kigali, logging the accelerometer, gyroscope, and gravity/total-acceleration channels. Training clips were collected on a Samsung SM-G973F at a true 100 Hz; the two unseen test recordings were collected on a Google Pixel 6, whose accelerometer delivered ~55 Hz despite a 100 Hz request (a hardware limit the app warns about). This two-device, two-rate setup is handled explicitly in pre-processing.</w:t>
+        <w:t xml:space="preserve">All data was recorded with the Sensor Logger app in Kigali, logging the accelerometer, gyroscope, and gravity/total-acceleration channels. Training clips were collected mostly on a Samsung SM-G973F at a true 100 Hz; the two unseen test recordings were collected on a Google Pixel 6, whose accelerometer delivered ~55 Hz despite a 100 Hz request (a hardware limit the app warns about). This two-device, two-rate setup is handled explicitly in pre-processing.</w:t>
       </w:r>
     </w:p>
     <w:p>
@@ -1060,7 +1045,7 @@
           <w:sz w:val="21"/>
           <w:szCs w:val="21"/>
         </w:rPr>
-        <w:t xml:space="preserve">[PASTE LINK]</w:t>
+        <w:t xml:space="preserve">https://youtube.com/shorts/MuexVpJiZWw</w:t>
       </w:r>
     </w:p>
     <w:p>
@@ -1088,7 +1073,7 @@
           <w:sz w:val="21"/>
           <w:szCs w:val="21"/>
         </w:rPr>
-        <w:t xml:space="preserve">[PASTE LINK]</w:t>
+        <w:t xml:space="preserve">https://youtube.com/shorts/fzsP2rYffkM</w:t>
       </w:r>
     </w:p>
     <w:p>
@@ -1116,7 +1101,7 @@
           <w:sz w:val="21"/>
           <w:szCs w:val="21"/>
         </w:rPr>
-        <w:t xml:space="preserve">[PASTE LINK]</w:t>
+        <w:t xml:space="preserve">https://youtube.com/shorts/NbohnmOFKUk</w:t>
       </w:r>
     </w:p>
     <w:p>
@@ -1144,7 +1129,7 @@
           <w:sz w:val="21"/>
           <w:szCs w:val="21"/>
         </w:rPr>
-        <w:t xml:space="preserve">[PASTE LINK]</w:t>
+        <w:t xml:space="preserve">https://youtube.com/shorts/TWcEYuwgiLQ</w:t>
       </w:r>
     </w:p>
     <w:p>
@@ -1173,7 +1158,7 @@
           <w:sz w:val="21"/>
           <w:szCs w:val="21"/>
         </w:rPr>
-        <w:t xml:space="preserve">From every 2 s window we extract seven features — five time-domain and two frequency-domain (plus the FFT-derived dominant frequency) — chosen so that each activity occupies a distinct region of feature space:</w:t>
+        <w:t xml:space="preserve">From every 2 s window we extract seven features — four time-domain and three frequency-domain (all FFT-derived) — chosen so that each activity occupies a distinct region of feature space:</w:t>
       </w:r>
     </w:p>
     <w:tbl>
@@ -3397,7 +3382,7 @@
           <w:sz w:val="21"/>
           <w:szCs w:val="21"/>
         </w:rPr>
-        <w:t xml:space="preserve">Classifying each window independently with the Gaussian emissions alone gives 75.7 % test accuracy; adding the HMM's transition structure and Viterbi decoding raises it to 81.4 %. The transitions smooth out isolated misreads by exploiting the fact that activities persist. Per file, test 1 scores 91.7 % and test 2 scores 73.5 %.</w:t>
+        <w:t xml:space="preserve">Classifying each window independently with the Gaussian emissions alone gives 75.7 % test accuracy, and simply adding Viterbi decoding on top of the supervised-initialised transitions leaves it unchanged at 75.7 %. It is the Baum–Welch-refined transition matrix that lifts accuracy to 81.4 %, smoothing out isolated misreads by exploiting the fact that activities persist. Per file, test 1 scores 91.7 % and test 2 scores 70.6 %.</w:t>
       </w:r>
     </w:p>
     <w:p>
@@ -3583,7 +3568,7 @@
           <w:sz w:val="17"/>
           <w:szCs w:val="17"/>
         </w:rPr>
-        <w:t xml:space="preserve">Figure 7. Decoded sequence for test recording 2 (accuracy 73.5 %): most errors occur in the jumping segment.</w:t>
+        <w:t xml:space="preserve">Figure 7. Decoded sequence for test recording 2 (accuracy 70.6 %): most errors occur in the jumping segment.</w:t>
       </w:r>
     </w:p>
     <w:p>

</xml_diff>

<commit_message>
report: add GitHub repository link under the header
</commit_message>
<xml_diff>
--- a/HMM_Activity_Recognition_Report.docx
+++ b/HMM_Activity_Recognition_Report.docx
@@ -50,7 +50,7 @@
     </w:p>
     <w:p>
       <w:pPr>
-        <w:spacing w:after="160"/>
+        <w:spacing w:after="40"/>
         <w:jc w:val="center"/>
       </w:pPr>
       <w:r>
@@ -61,6 +61,30 @@
         </w:rPr>
         <w:t xml:space="preserve">African Leadership University   •   30 October 2026</w:t>
       </w:r>
+    </w:p>
+    <w:p>
+      <w:pPr>
+        <w:spacing w:after="160"/>
+        <w:jc w:val="center"/>
+      </w:pPr>
+      <w:r>
+        <w:rPr>
+          <w:color w:val="666666"/>
+          <w:sz w:val="19"/>
+          <w:szCs w:val="19"/>
+        </w:rPr>
+        <w:t xml:space="preserve">Code &amp; data (GitHub): </w:t>
+      </w:r>
+      <w:hyperlink r:id="rId200">
+        <w:r>
+          <w:rPr>
+            <w:rStyle w:val="Hyperlink"/>
+            <w:sz w:val="19"/>
+            <w:szCs w:val="19"/>
+          </w:rPr>
+          <w:t xml:space="preserve">github.com/enockmugisha1/hmm-activity-recognition</w:t>
+        </w:r>
+      </w:hyperlink>
     </w:p>
     <w:p>
       <w:pPr>

</xml_diff>

<commit_message>
report: make the four data-collection video links clickable
</commit_message>
<xml_diff>
--- a/HMM_Activity_Recognition_Report.docx
+++ b/HMM_Activity_Recognition_Report.docx
@@ -1063,14 +1063,16 @@
         </w:rPr>
         <w:t xml:space="preserve">Standing: </w:t>
       </w:r>
-      <w:r>
-        <w:rPr>
-          <w:color w:val="A04000"/>
-          <w:sz w:val="21"/>
-          <w:szCs w:val="21"/>
-        </w:rPr>
-        <w:t xml:space="preserve">https://youtube.com/shorts/MuexVpJiZWw</w:t>
-      </w:r>
+      <w:hyperlink r:id="rId201">
+        <w:r>
+          <w:rPr>
+            <w:rStyle w:val="Hyperlink"/>
+            <w:sz w:val="21"/>
+            <w:szCs w:val="21"/>
+          </w:rPr>
+          <w:t xml:space="preserve">https://youtube.com/shorts/MuexVpJiZWw</w:t>
+        </w:r>
+      </w:hyperlink>
     </w:p>
     <w:p>
       <w:pPr>
@@ -1091,14 +1093,16 @@
         </w:rPr>
         <w:t xml:space="preserve">Walking: </w:t>
       </w:r>
-      <w:r>
-        <w:rPr>
-          <w:color w:val="A04000"/>
-          <w:sz w:val="21"/>
-          <w:szCs w:val="21"/>
-        </w:rPr>
-        <w:t xml:space="preserve">https://youtube.com/shorts/fzsP2rYffkM</w:t>
-      </w:r>
+      <w:hyperlink r:id="rId202">
+        <w:r>
+          <w:rPr>
+            <w:rStyle w:val="Hyperlink"/>
+            <w:sz w:val="21"/>
+            <w:szCs w:val="21"/>
+          </w:rPr>
+          <w:t xml:space="preserve">https://youtube.com/shorts/fzsP2rYffkM</w:t>
+        </w:r>
+      </w:hyperlink>
     </w:p>
     <w:p>
       <w:pPr>
@@ -1119,14 +1123,16 @@
         </w:rPr>
         <w:t xml:space="preserve">Jumping: </w:t>
       </w:r>
-      <w:r>
-        <w:rPr>
-          <w:color w:val="A04000"/>
-          <w:sz w:val="21"/>
-          <w:szCs w:val="21"/>
-        </w:rPr>
-        <w:t xml:space="preserve">https://youtube.com/shorts/NbohnmOFKUk</w:t>
-      </w:r>
+      <w:hyperlink r:id="rId203">
+        <w:r>
+          <w:rPr>
+            <w:rStyle w:val="Hyperlink"/>
+            <w:sz w:val="21"/>
+            <w:szCs w:val="21"/>
+          </w:rPr>
+          <w:t xml:space="preserve">https://youtube.com/shorts/NbohnmOFKUk</w:t>
+        </w:r>
+      </w:hyperlink>
     </w:p>
     <w:p>
       <w:pPr>
@@ -1147,14 +1153,16 @@
         </w:rPr>
         <w:t xml:space="preserve">Still: </w:t>
       </w:r>
-      <w:r>
-        <w:rPr>
-          <w:color w:val="A04000"/>
-          <w:sz w:val="21"/>
-          <w:szCs w:val="21"/>
-        </w:rPr>
-        <w:t xml:space="preserve">https://youtube.com/shorts/TWcEYuwgiLQ</w:t>
-      </w:r>
+      <w:hyperlink r:id="rId204">
+        <w:r>
+          <w:rPr>
+            <w:rStyle w:val="Hyperlink"/>
+            <w:sz w:val="21"/>
+            <w:szCs w:val="21"/>
+          </w:rPr>
+          <w:t xml:space="preserve">https://youtube.com/shorts/TWcEYuwgiLQ</w:t>
+        </w:r>
+      </w:hyperlink>
     </w:p>
     <w:p>
       <w:pPr>

</xml_diff>

<commit_message>
retrain on expanded dataset (86 recordings, 20+ clips/activity): test accuracy 81.4% -> 90.0%
- Add 21 new single-activity clips (walking/jumping/still to 20+, standing to 23)
- Re-run notebook end-to-end: regenerate all figures, results tables
- Test accuracy 90.0%; jumping sensitivity 0.44 -> 0.88; standing now weakest
- Rewrite report Sections 2/4/5/6 + both tables + all 7 figures to match
- Report per-window (91.4%) vs HMM (90.0%) honestly: comparable at this data scale
- Update README results block
</commit_message>
<xml_diff>
--- a/HMM_Activity_Recognition_Report.docx
+++ b/HMM_Activity_Recognition_Report.docx
@@ -151,7 +151,7 @@
           <w:sz w:val="21"/>
           <w:szCs w:val="21"/>
         </w:rPr>
-        <w:t xml:space="preserve">All data was recorded with the Sensor Logger app in Kigali, logging the accelerometer, gyroscope, and gravity/total-acceleration channels. Training clips were collected mostly on a Samsung SM-G973F at a true 100 Hz; the two unseen test recordings were collected on a Google Pixel 6, whose accelerometer delivered ~55 Hz despite a 100 Hz request (a hardware limit the app warns about). This two-device, two-rate setup is handled explicitly in pre-processing.</w:t>
+        <w:t xml:space="preserve">All data was recorded with the Sensor Logger app in Kigali, logging the accelerometer, gyroscope, and gravity/total-acceleration channels. Training clips were collected on two phones — a Samsung SM-G973F, which held a steady 100 Hz, and a Google Pixel 6; the two unseen test recordings were collected on the Pixel 6. The app warns that the true rate is device-dependent, and in practice the recorded accelerometer rate ranged from ~55 Hz to 441 Hz across the two phones and rate settings. This multi-rate, two-device setup is handled explicitly in pre-processing.</w:t>
       </w:r>
     </w:p>
     <w:p>
@@ -174,7 +174,7 @@
           <w:sz w:val="21"/>
           <w:szCs w:val="21"/>
         </w:rPr>
-        <w:t xml:space="preserve">65 labelled recordings in total: 63 single-activity training clips (18 standing, 15 walking, 15 jumping, 15 still) of 5–13 s each, plus 2 continuous ~45 s test recordings in which the phone moves through all four activities in sequence. Each activity exceeds the 90 s minimum.</w:t>
+        <w:t xml:space="preserve">86 labelled recordings in total: 84 single-activity training clips (23 standing, 21 walking, 20 jumping, 20 still) of 5–13 s each, plus 2 continuous ~45 s test recordings in which the phone moves through all four activities in sequence. Every activity now has well over 130 s of training data, comfortably clearing the 90 s minimum.</w:t>
       </w:r>
     </w:p>
     <w:tbl>
@@ -387,7 +387,7 @@
                 <w:sz w:val="18"/>
                 <w:szCs w:val="18"/>
               </w:rPr>
-              <w:t xml:space="preserve">100.6</w:t>
+              <w:t xml:space="preserve">160.2</w:t>
             </w:r>
           </w:p>
         </w:tc>
@@ -441,7 +441,7 @@
                 <w:sz w:val="18"/>
                 <w:szCs w:val="18"/>
               </w:rPr>
-              <w:t xml:space="preserve">111.6</w:t>
+              <w:t xml:space="preserve">171.2</w:t>
             </w:r>
           </w:p>
         </w:tc>
@@ -468,7 +468,7 @@
                 <w:sz w:val="18"/>
                 <w:szCs w:val="18"/>
               </w:rPr>
-              <w:t xml:space="preserve">18</w:t>
+              <w:t xml:space="preserve">23</w:t>
             </w:r>
           </w:p>
         </w:tc>
@@ -524,7 +524,7 @@
                 <w:sz w:val="18"/>
                 <w:szCs w:val="18"/>
               </w:rPr>
-              <w:t xml:space="preserve">73.7</w:t>
+              <w:t xml:space="preserve">140.9</w:t>
             </w:r>
           </w:p>
         </w:tc>
@@ -578,7 +578,7 @@
                 <w:sz w:val="18"/>
                 <w:szCs w:val="18"/>
               </w:rPr>
-              <w:t xml:space="preserve">96.7</w:t>
+              <w:t xml:space="preserve">163.9</w:t>
             </w:r>
           </w:p>
         </w:tc>
@@ -605,7 +605,7 @@
                 <w:sz w:val="18"/>
                 <w:szCs w:val="18"/>
               </w:rPr>
-              <w:t xml:space="preserve">15</w:t>
+              <w:t xml:space="preserve">21</w:t>
             </w:r>
           </w:p>
         </w:tc>
@@ -661,7 +661,7 @@
                 <w:sz w:val="18"/>
                 <w:szCs w:val="18"/>
               </w:rPr>
-              <w:t xml:space="preserve">75.4</w:t>
+              <w:t xml:space="preserve">135.9</w:t>
             </w:r>
           </w:p>
         </w:tc>
@@ -715,7 +715,7 @@
                 <w:sz w:val="18"/>
                 <w:szCs w:val="18"/>
               </w:rPr>
-              <w:t xml:space="preserve">90.4</w:t>
+              <w:t xml:space="preserve">150.9</w:t>
             </w:r>
           </w:p>
         </w:tc>
@@ -742,7 +742,7 @@
                 <w:sz w:val="18"/>
                 <w:szCs w:val="18"/>
               </w:rPr>
-              <w:t xml:space="preserve">15</w:t>
+              <w:t xml:space="preserve">20</w:t>
             </w:r>
           </w:p>
         </w:tc>
@@ -798,7 +798,7 @@
                 <w:sz w:val="18"/>
                 <w:szCs w:val="18"/>
               </w:rPr>
-              <w:t xml:space="preserve">72.5</w:t>
+              <w:t xml:space="preserve">131.9</w:t>
             </w:r>
           </w:p>
         </w:tc>
@@ -852,7 +852,7 @@
                 <w:sz w:val="18"/>
                 <w:szCs w:val="18"/>
               </w:rPr>
-              <w:t xml:space="preserve">92.0</w:t>
+              <w:t xml:space="preserve">151.4</w:t>
             </w:r>
           </w:p>
         </w:tc>
@@ -879,7 +879,7 @@
                 <w:sz w:val="18"/>
                 <w:szCs w:val="18"/>
               </w:rPr>
-              <w:t xml:space="preserve">15</w:t>
+              <w:t xml:space="preserve">20</w:t>
             </w:r>
           </w:p>
         </w:tc>
@@ -910,7 +910,7 @@
           <w:sz w:val="21"/>
           <w:szCs w:val="21"/>
         </w:rPr>
-        <w:t xml:space="preserve">Every recording is brought to a common 50 Hz. Faster streams (the 100 Hz Samsung data) are first passed through a zero-phase windowed-sinc low-pass filter at 0.4×50 Hz to prevent aliasing, then linearly interpolated onto a uniform 50 Hz grid; the ~55 Hz Pixel data is interpolated onto the same grid. After this step, training and test data share identical timing, so window sample counts and feature scales are identical across phones.</w:t>
+        <w:t xml:space="preserve">Every recording is brought to a common 50 Hz. Faster streams (the 100 Hz Samsung data and the higher-rate Pixel clips) are first passed through a zero-phase windowed-sinc low-pass filter at 0.4×50 Hz to prevent aliasing, then linearly interpolated onto a uniform 50 Hz grid; the ~55 Hz Pixel test data is interpolated up onto the same grid. After this step, every recording shares identical timing, so window sample counts and feature scales are identical across phones and rates.</w:t>
       </w:r>
     </w:p>
     <w:p>
@@ -956,7 +956,7 @@
           <w:sz w:val="21"/>
           <w:szCs w:val="21"/>
         </w:rPr>
-        <w:t xml:space="preserve">For each file we drop non-finite rows, sort and de-duplicate timestamps, trim 0.5 s from both ends (where tapping start/stop shakes the phone), align accelerometer and gyroscope on a shared clock, and keep gravity in the acceleration signal so phone tilt stays measurable. The maximum sampling gap across all 65 files is 0.14 s, and gravity handling is identical everywhere.</w:t>
+        <w:t xml:space="preserve">For each file we drop non-finite rows, sort and de-duplicate timestamps, trim 0.5 s from both ends (where tapping start/stop shakes the phone), align accelerometer and gyroscope on a shared clock, and keep gravity in the acceleration signal so phone tilt stays measurable. The maximum sampling gap across all 86 files is 0.14 s, and gravity handling is identical everywhere.</w:t>
       </w:r>
     </w:p>
     <w:p>
@@ -2388,7 +2388,7 @@
           <w:sz w:val="21"/>
           <w:szCs w:val="21"/>
         </w:rPr>
-        <w:t xml:space="preserve">Baum–Welch stops when the mean log-likelihood per window improves by less than 1×10⁻⁵ (a proper convergence check rather than a fixed iteration count). It converged in 5 iterations, with the training log-likelihood rising monotonically from −75.8 to −66.8.</w:t>
+        <w:t xml:space="preserve">Baum–Welch stops when the mean log-likelihood per window improves by less than 1×10⁻⁵ (a proper convergence check rather than a fixed iteration count). It converged in 4 iterations, with the training log-likelihood rising monotonically from −755.5 to −727.5.</w:t>
       </w:r>
     </w:p>
     <w:p>
@@ -2808,7 +2808,7 @@
                 <w:sz w:val="18"/>
                 <w:szCs w:val="18"/>
               </w:rPr>
-              <w:t xml:space="preserve">0.847</w:t>
+              <w:t xml:space="preserve">0.966</w:t>
             </w:r>
           </w:p>
         </w:tc>
@@ -2835,7 +2835,7 @@
                 <w:sz w:val="18"/>
                 <w:szCs w:val="18"/>
               </w:rPr>
-              <w:t xml:space="preserve">0.829</w:t>
+              <w:t xml:space="preserve">0.929</w:t>
             </w:r>
           </w:p>
         </w:tc>
@@ -2945,7 +2945,7 @@
                 <w:sz w:val="18"/>
                 <w:szCs w:val="18"/>
               </w:rPr>
-              <w:t xml:space="preserve">0.917</w:t>
+              <w:t xml:space="preserve">0.896</w:t>
             </w:r>
           </w:p>
         </w:tc>
@@ -2972,7 +2972,7 @@
                 <w:sz w:val="18"/>
                 <w:szCs w:val="18"/>
               </w:rPr>
-              <w:t xml:space="preserve">0.943</w:t>
+              <w:t xml:space="preserve">0.929</w:t>
             </w:r>
           </w:p>
         </w:tc>
@@ -3055,7 +3055,7 @@
                 <w:sz w:val="18"/>
                 <w:szCs w:val="18"/>
               </w:rPr>
-              <w:t xml:space="preserve">0.438</w:t>
+              <w:t xml:space="preserve">0.875</w:t>
             </w:r>
           </w:p>
         </w:tc>
@@ -3109,7 +3109,7 @@
                 <w:sz w:val="18"/>
                 <w:szCs w:val="18"/>
               </w:rPr>
-              <w:t xml:space="preserve">0.871</w:t>
+              <w:t xml:space="preserve">0.971</w:t>
             </w:r>
           </w:p>
         </w:tc>
@@ -3192,7 +3192,7 @@
                 <w:sz w:val="18"/>
                 <w:szCs w:val="18"/>
               </w:rPr>
-              <w:t xml:space="preserve">0.952</w:t>
+              <w:t xml:space="preserve">0.905</w:t>
             </w:r>
           </w:p>
         </w:tc>
@@ -3246,7 +3246,7 @@
                 <w:sz w:val="18"/>
                 <w:szCs w:val="18"/>
               </w:rPr>
-              <w:t xml:space="preserve">0.986</w:t>
+              <w:t xml:space="preserve">0.971</w:t>
             </w:r>
           </w:p>
         </w:tc>
@@ -3329,7 +3329,7 @@
                 <w:sz w:val="18"/>
                 <w:szCs w:val="18"/>
               </w:rPr>
-              <w:t xml:space="preserve">0.779</w:t>
+              <w:t xml:space="preserve">0.877</w:t>
             </w:r>
           </w:p>
         </w:tc>
@@ -3356,7 +3356,7 @@
                 <w:sz w:val="18"/>
                 <w:szCs w:val="18"/>
               </w:rPr>
-              <w:t xml:space="preserve">0.941</w:t>
+              <w:t xml:space="preserve">0.965</w:t>
             </w:r>
           </w:p>
         </w:tc>
@@ -3383,7 +3383,7 @@
                 <w:sz w:val="18"/>
                 <w:szCs w:val="18"/>
               </w:rPr>
-              <w:t xml:space="preserve">0.814</w:t>
+              <w:t xml:space="preserve">0.900</w:t>
             </w:r>
           </w:p>
         </w:tc>
@@ -3406,7 +3406,7 @@
           <w:sz w:val="21"/>
           <w:szCs w:val="21"/>
         </w:rPr>
-        <w:t xml:space="preserve">The HMM earns its keep. </w:t>
+        <w:t xml:space="preserve">Temporal model vs. per-window baseline. </w:t>
       </w:r>
       <w:r>
         <w:rPr>
@@ -3414,7 +3414,7 @@
           <w:sz w:val="21"/>
           <w:szCs w:val="21"/>
         </w:rPr>
-        <w:t xml:space="preserve">Classifying each window independently with the Gaussian emissions alone gives 75.7 % test accuracy, and simply adding Viterbi decoding on top of the supervised-initialised transitions leaves it unchanged at 75.7 %. It is the Baum–Welch-refined transition matrix that lifts accuracy to 81.4 %, smoothing out isolated misreads by exploiting the fact that activities persist. Per file, test 1 scores 91.7 % and test 2 scores 70.6 %.</w:t>
+        <w:t xml:space="preserve">With this larger, more varied training set the Gaussian emissions alone already classify each window well, reaching 91.4 % test accuracy; adding the Baum–Welch transition matrix and Viterbi decoding gives 90.0 %. The two are within a single window of each other (out of 70), so at this data scale the temporal prior neither clearly helps nor hurts the headline accuracy — the emissions have become discriminative enough on their own. The transition model still earns its place: it enforces realistic dwell times and is the right tool whenever the per-window evidence is noisier or sparser than it is here. Per file, test 1 scores 94.4 % and test 2 scores 85.3 %.</w:t>
       </w:r>
     </w:p>
     <w:p>
@@ -3476,7 +3476,7 @@
           <w:sz w:val="17"/>
           <w:szCs w:val="17"/>
         </w:rPr>
-        <w:t xml:space="preserve">Figure 5. Confusion matrix on the unseen test windows. Still, walking and standing are recovered well; jumping is the main source of error.</w:t>
+        <w:t xml:space="preserve">Figure 5. Confusion matrix on the unseen test windows. Walking, jumping and still are recovered well; standing is the main source of error, occasionally read as walking.</w:t>
       </w:r>
     </w:p>
     <w:p>
@@ -3538,7 +3538,7 @@
           <w:sz w:val="17"/>
           <w:szCs w:val="17"/>
         </w:rPr>
-        <w:t xml:space="preserve">Figure 6. Decoded sequence for test recording 1 (accuracy 91.7 %): sensor signal, per-window evidence, and true vs. Viterbi-predicted activity path.</w:t>
+        <w:t xml:space="preserve">Figure 6. Decoded sequence for test recording 1 (accuracy 94.4 %): sensor signal, per-window evidence, and true vs. Viterbi-predicted activity path.</w:t>
       </w:r>
     </w:p>
     <w:p>
@@ -3600,7 +3600,7 @@
           <w:sz w:val="17"/>
           <w:szCs w:val="17"/>
         </w:rPr>
-        <w:t xml:space="preserve">Figure 7. Decoded sequence for test recording 2 (accuracy 70.6 %): most errors occur in the jumping segment.</w:t>
+        <w:t xml:space="preserve">Figure 7. Decoded sequence for test recording 2 (accuracy 85.3 %): most errors fall on the short standing segments, which are read as walking.</w:t>
       </w:r>
     </w:p>
     <w:p>
@@ -3639,7 +3639,7 @@
           <w:sz w:val="21"/>
           <w:szCs w:val="21"/>
         </w:rPr>
-        <w:t xml:space="preserve">Still (98.6 % accuracy) and walking (100 % sensitivity) are easiest: still is almost flat and walking has a clear, steady cadence, so both sit far from the other classes in feature space. Jumping is hardest (43.8 % sensitivity): although jumping is very energetic, on the Pixel 6 its windows are most often confused with standing at the start and end of the jump bursts, where the phone is briefly steady before and after the impacts, and the ~55 Hz sampling slightly blunts the high-frequency content the model learned from 100 Hz training jumps.</w:t>
+        <w:t xml:space="preserve">Walking (100 % sensitivity) is the easiest to recognise, and jumping and still follow closely (97.1 % accuracy each): walking has a clear, steady cadence, still is almost flat, and jumping is highly energetic, so all three sit far apart in feature space. Standing is the hardest (72.7 % sensitivity): a person standing with the phone in hand still produces small sways and hand tremor that resemble the low end of walking, so three of the eleven standing windows are read as walking. The extra jump recordings across both phones are what make jumping reliable here, since the model has now seen its high-amplitude impacts at several sampling rates.</w:t>
       </w:r>
     </w:p>
     <w:p>
@@ -3662,7 +3662,7 @@
           <w:sz w:val="21"/>
           <w:szCs w:val="21"/>
         </w:rPr>
-        <w:t xml:space="preserve">The learned transition matrix is strongly diagonal (self-transition ≈0.93–0.95), implying an expected dwell time of roughly 13–18 s per activity before switching. This matches how people actually move — we hold a posture for many seconds rather than flipping activities every second — and is exactly the prior that lets Viterbi correct noisy single-window predictions.</w:t>
+        <w:t xml:space="preserve">The learned transition matrix is strongly diagonal (self-transition ≈0.96–0.97), implying an expected dwell time of roughly 26–31 s per activity before switching. This matches how people actually move — we hold a posture for many seconds rather than flipping activities every second — and is exactly the prior that lets Viterbi correct noisy single-window predictions.</w:t>
       </w:r>
     </w:p>
     <w:p>
@@ -3685,7 +3685,7 @@
           <w:sz w:val="21"/>
           <w:szCs w:val="21"/>
         </w:rPr>
-        <w:t xml:space="preserve">Training at 100 Hz and testing at ~55 Hz is a genuine domain shift; resampling everything to 50 Hz removes most of it, but residual differences in how each phone's sensors render the sharp impacts of jumping explain much of the train–test gap (train 98.7 % vs. test 81.4 %). Gyroscope and accelerometer noise mainly affect the low-energy classes, which is why standing occasionally leaks into still.</w:t>
+        <w:t xml:space="preserve">Recordings span ~55 Hz to 441 Hz across the two phones; resampling everything to a common 50 Hz removes most of this heterogeneity, and because the training set now includes Pixel clips as well as Samsung ones, the train–test gap is modest (train 98.6 % vs. test 90.0 %). The residual gap sits in the low-energy classes: accelerometer and gyroscope noise make a hand-held standing posture occasionally resemble slow walking, which is the model's main remaining error.</w:t>
       </w:r>
     </w:p>
     <w:p>
@@ -3708,7 +3708,7 @@
           <w:sz w:val="21"/>
           <w:szCs w:val="21"/>
         </w:rPr>
-        <w:t xml:space="preserve">(i) More data from more participants and phones would teach the model device-invariant jumping patterns; (ii) continuous multi-activity training recordings would let Baum–Welch learn richer, asymmetric transitions instead of near-symmetric ones; (iii) extra features (jerk, axis-correlation, higher-frequency bands) and a full-covariance emission could sharpen the jumping/standing boundary; (iv) adding the magnetometer or a second body location would disambiguate similar-energy postures.</w:t>
+        <w:t xml:space="preserve">(i) Data from more participants (the current set is from one person) would test cross-subject generalisation, since the model is already trained across two phones; (ii) continuous multi-activity training recordings would let Baum–Welch learn richer, asymmetric transitions instead of near-symmetric ones; (iii) extra features (jerk, axis-correlation, higher-frequency bands) and a full-covariance emission could sharpen the standing/walking boundary; (iv) adding the magnetometer or a second body location would disambiguate similar-energy postures.</w:t>
       </w:r>
     </w:p>
     <w:p>
@@ -3731,7 +3731,7 @@
           <w:sz w:val="21"/>
           <w:szCs w:val="21"/>
         </w:rPr>
-        <w:t xml:space="preserve">A from-scratch Gaussian-emission HMM, trained with Baum–Welch and decoded with Viterbi, recognises four human activities from phone accelerometer and gyroscope data at 81.4 % accuracy on genuinely unseen, different-device data. The temporal model measurably outperforms per-window classification, and its learned transitions and dwell times are behaviourally realistic — a promising, low-cost basis for the mobility-monitoring use case that motivated the work.</w:t>
+        <w:t xml:space="preserve">A from-scratch Gaussian-emission HMM, trained with Baum–Welch and decoded with Viterbi, recognises four human activities from phone accelerometer and gyroscope data at 90.0 % accuracy on genuinely unseen, different-device data. Per-window classification and the full temporal model perform comparably at this data scale, while its learned transitions and dwell times stay behaviourally realistic — a promising, low-cost basis for the mobility-monitoring use case that motivated the work.</w:t>
       </w:r>
     </w:p>
     <w:sectPr>

</xml_diff>

<commit_message>
report: add centered 'Page X of Y' footer
</commit_message>
<xml_diff>
--- a/HMM_Activity_Recognition_Report.docx
+++ b/HMM_Activity_Recognition_Report.docx
@@ -3735,6 +3735,7 @@
       </w:r>
     </w:p>
     <w:sectPr>
+      <w:footerReference w:type="default" r:id="rId205"/>
       <w:pgSz w:w="12240" w:h="15840" w:orient="portrait"/>
       <w:pgMar w:top="1080" w:right="1440" w:bottom="1080" w:left="1440" w:header="708" w:footer="708" w:gutter="0"/>
       <w:pgNumType/>
@@ -3779,6 +3780,85 @@
     </w:p>
   </w:endnote>
 </w:endnotes>
+</file>
+
+<file path=word/footer1.xml><?xml version="1.0" encoding="utf-8"?>
+<w:ftr xmlns:w="http://schemas.openxmlformats.org/wordprocessingml/2006/main">
+  <w:p>
+    <w:pPr>
+      <w:jc w:val="center"/>
+      <w:rPr>
+        <w:color w:val="888888"/>
+        <w:sz w:val="16"/>
+        <w:szCs w:val="16"/>
+      </w:rPr>
+    </w:pPr>
+    <w:r>
+      <w:rPr>
+        <w:color w:val="888888"/>
+        <w:sz w:val="16"/>
+        <w:szCs w:val="16"/>
+      </w:rPr>
+      <w:t xml:space="preserve">Page </w:t>
+    </w:r>
+    <w:r>
+      <w:rPr>
+        <w:color w:val="888888"/>
+        <w:sz w:val="16"/>
+        <w:szCs w:val="16"/>
+      </w:rPr>
+      <w:fldChar w:fldCharType="begin"/>
+    </w:r>
+    <w:r>
+      <w:rPr>
+        <w:color w:val="888888"/>
+        <w:sz w:val="16"/>
+        <w:szCs w:val="16"/>
+      </w:rPr>
+      <w:instrText xml:space="preserve"> PAGE </w:instrText>
+    </w:r>
+    <w:r>
+      <w:rPr>
+        <w:color w:val="888888"/>
+        <w:sz w:val="16"/>
+        <w:szCs w:val="16"/>
+      </w:rPr>
+      <w:fldChar w:fldCharType="end"/>
+    </w:r>
+    <w:r>
+      <w:rPr>
+        <w:color w:val="888888"/>
+        <w:sz w:val="16"/>
+        <w:szCs w:val="16"/>
+      </w:rPr>
+      <w:t xml:space="preserve"> of </w:t>
+    </w:r>
+    <w:r>
+      <w:rPr>
+        <w:color w:val="888888"/>
+        <w:sz w:val="16"/>
+        <w:szCs w:val="16"/>
+      </w:rPr>
+      <w:fldChar w:fldCharType="begin"/>
+    </w:r>
+    <w:r>
+      <w:rPr>
+        <w:color w:val="888888"/>
+        <w:sz w:val="16"/>
+        <w:szCs w:val="16"/>
+      </w:rPr>
+      <w:instrText xml:space="preserve"> NUMPAGES </w:instrText>
+    </w:r>
+    <w:r>
+      <w:rPr>
+        <w:color w:val="888888"/>
+        <w:sz w:val="16"/>
+        <w:szCs w:val="16"/>
+      </w:rPr>
+      <w:fldChar w:fldCharType="end"/>
+    </w:r>
+  </w:p>
+</w:ftr>
 </file>
 
 <file path=word/footnotes.xml><?xml version="1.0" encoding="utf-8"?>

</xml_diff>

<commit_message>
report: fix page-number footer (full field structure + update-on-open)
</commit_message>
<xml_diff>
--- a/HMM_Activity_Recognition_Report.docx
+++ b/HMM_Activity_Recognition_Report.docx
@@ -3823,6 +3823,22 @@
         <w:sz w:val="16"/>
         <w:szCs w:val="16"/>
       </w:rPr>
+      <w:fldChar w:fldCharType="separate"/>
+    </w:r>
+    <w:r>
+      <w:rPr>
+        <w:color w:val="888888"/>
+        <w:sz w:val="16"/>
+        <w:szCs w:val="16"/>
+      </w:rPr>
+      <w:t>1</w:t>
+    </w:r>
+    <w:r>
+      <w:rPr>
+        <w:color w:val="888888"/>
+        <w:sz w:val="16"/>
+        <w:szCs w:val="16"/>
+      </w:rPr>
       <w:fldChar w:fldCharType="end"/>
     </w:r>
     <w:r>
@@ -3848,6 +3864,22 @@
         <w:szCs w:val="16"/>
       </w:rPr>
       <w:instrText xml:space="preserve"> NUMPAGES </w:instrText>
+    </w:r>
+    <w:r>
+      <w:rPr>
+        <w:color w:val="888888"/>
+        <w:sz w:val="16"/>
+        <w:szCs w:val="16"/>
+      </w:rPr>
+      <w:fldChar w:fldCharType="separate"/>
+    </w:r>
+    <w:r>
+      <w:rPr>
+        <w:color w:val="888888"/>
+        <w:sz w:val="16"/>
+        <w:szCs w:val="16"/>
+      </w:rPr>
+      <w:t>1</w:t>
     </w:r>
     <w:r>
       <w:rPr>

</xml_diff>